<commit_message>
adjust: modified pdf and docx files to follow request from PLAYG-46
</commit_message>
<xml_diff>
--- a/src/assets/file_samples/sample.docx
+++ b/src/assets/file_samples/sample.docx
@@ -1,7 +1,56 @@
 
 <file path=word/document.xml><?xml version="1.0" encoding="utf-8"?>
 <w:document xmlns:mc="http://schemas.openxmlformats.org/markup-compatibility/2006" xmlns:o="urn:schemas-microsoft-com:office:office" xmlns:r="http://schemas.openxmlformats.org/officeDocument/2006/relationships" xmlns:m="http://schemas.openxmlformats.org/officeDocument/2006/math" xmlns:v="urn:schemas-microsoft-com:vml" xmlns:wp="http://schemas.openxmlformats.org/drawingml/2006/wordprocessingDrawing" xmlns:w10="urn:schemas-microsoft-com:office:word" xmlns:w="http://schemas.openxmlformats.org/wordprocessingml/2006/main" xmlns:wne="http://schemas.microsoft.com/office/word/2006/wordml" xmlns:sl="http://schemas.openxmlformats.org/schemaLibrary/2006/main" xmlns:a="http://schemas.openxmlformats.org/drawingml/2006/main" xmlns:pic="http://schemas.openxmlformats.org/drawingml/2006/picture" xmlns:c="http://schemas.openxmlformats.org/drawingml/2006/chart" xmlns:lc="http://schemas.openxmlformats.org/drawingml/2006/lockedCanvas" xmlns:dgm="http://schemas.openxmlformats.org/drawingml/2006/diagram" xmlns:wps="http://schemas.microsoft.com/office/word/2010/wordprocessingShape" xmlns:wpg="http://schemas.microsoft.com/office/word/2010/wordprocessingGroup" xmlns:w14="http://schemas.microsoft.com/office/word/2010/wordml" xmlns:w15="http://schemas.microsoft.com/office/word/2012/wordml" xmlns:w16="http://schemas.microsoft.com/office/word/2018/wordml" xmlns:w16cex="http://schemas.microsoft.com/office/word/2018/wordml/cex" xmlns:w16cid="http://schemas.microsoft.com/office/word/2016/wordml/cid" xmlns="http://schemas.microsoft.com/office/tasks/2019/documenttasks" xmlns:cr="http://schemas.microsoft.com/office/comments/2020/reactions">
+  <w:background w:color="FFFFFF"/>
   <w:body>
+    <w:p>
+      <w:pPr>
+        <w:pStyle w:val="Title"/>
+        <w:spacing w:after="120" w:before="480" w:lineRule="auto"/>
+        <w:rPr>
+          <w:rFonts w:ascii="Roboto Medium" w:cs="Roboto Medium" w:eastAsia="Roboto Medium" w:hAnsi="Roboto Medium"/>
+          <w:b w:val="1"/>
+          <w:bCs w:val="1"/>
+          <w:color w:val="1f1f1f"/>
+          <w:sz w:val="72"/>
+          <w:szCs w:val="72"/>
+        </w:rPr>
+      </w:pPr>
+      <w:bookmarkStart w:colFirst="0" w:colLast="0" w:name="_3kbjkjchijb" w:id="0"/>
+      <w:bookmarkEnd w:id="0"/>
+      <w:r>
+        <w:rPr>
+          <w:rFonts w:ascii="Roboto Medium" w:cs="Roboto Medium" w:eastAsia="Roboto Medium" w:hAnsi="Roboto Medium"/>
+          <w:b w:val="1"/>
+          <w:bCs w:val="1"/>
+          <w:color w:val="1f1f1f"/>
+          <w:sz w:val="72"/>
+          <w:szCs w:val="72"/>
+          <w:rtl w:val="0"/>
+        </w:rPr>
+        <w:t xml:space="preserve">Simple Data Table</w:t>
+      </w:r>
+    </w:p>
+    <w:p>
+      <w:pPr>
+        <w:rPr>
+          <w:rFonts w:ascii="Roboto" w:cs="Roboto" w:eastAsia="Roboto" w:hAnsi="Roboto"/>
+          <w:color w:val="1f1f1f"/>
+          <w:sz w:val="24"/>
+          <w:szCs w:val="24"/>
+        </w:rPr>
+      </w:pPr>
+      <w:r>
+        <w:rPr>
+          <w:rFonts w:ascii="Roboto" w:cs="Roboto" w:eastAsia="Roboto" w:hAnsi="Roboto"/>
+          <w:color w:val="1f1f1f"/>
+          <w:sz w:val="24"/>
+          <w:szCs w:val="24"/>
+          <w:rtl w:val="0"/>
+        </w:rPr>
+        <w:t xml:space="preserve">Here is a simple table with sample data.</w:t>
+      </w:r>
+    </w:p>
     <w:p>
       <w:pPr>
         <w:rPr/>
@@ -10,12 +59,425 @@
         <w:rPr>
           <w:rtl w:val="0"/>
         </w:rPr>
-        <w:t xml:space="preserve">Lorem ipsum dolor sit amet, consectetur adipiscing elit, sed do eiusmod tempor incididunt ut labore et dolore magna aliqua. Ut enim ad minim veniam, quis nostrud exercitation ullamco laboris nisi ut aliquip ex ea commodo consequat. Duis aute irure dolor in reprehenderit in voluptate velit esse cillum dolore eu fugiat nulla pariatur. Excepteur sint occaecat cupidatat non proident, sunt in culpa qui officia deserunt mollit anim id est laborum.</w:t>
+      </w:r>
+    </w:p>
+    <w:tbl>
+      <w:tblPr>
+        <w:tblStyle w:val="Table1"/>
+        <w:tblW w:w="9073.0" w:type="dxa"/>
+        <w:jc w:val="left"/>
+        <w:tblBorders>
+          <w:top w:color="000000" w:space="0" w:sz="8" w:val="single"/>
+          <w:left w:color="000000" w:space="0" w:sz="8" w:val="single"/>
+          <w:bottom w:color="000000" w:space="0" w:sz="8" w:val="single"/>
+          <w:right w:color="000000" w:space="0" w:sz="8" w:val="single"/>
+          <w:insideH w:color="000000" w:space="0" w:sz="8" w:val="single"/>
+          <w:insideV w:color="000000" w:space="0" w:sz="8" w:val="single"/>
+        </w:tblBorders>
+        <w:tblLayout w:type="fixed"/>
+        <w:tblLook w:val="0600"/>
+      </w:tblPr>
+      <w:tblGrid>
+        <w:gridCol w:w="3024.3333333333335"/>
+        <w:gridCol w:w="3024.3333333333335"/>
+        <w:gridCol w:w="3024.3333333333335"/>
+        <w:tblGridChange w:id="0">
+          <w:tblGrid>
+            <w:gridCol w:w="3024.3333333333335"/>
+            <w:gridCol w:w="3024.3333333333335"/>
+            <w:gridCol w:w="3024.3333333333335"/>
+          </w:tblGrid>
+        </w:tblGridChange>
+      </w:tblGrid>
+      <w:tr>
+        <w:trPr>
+          <w:cantSplit w:val="0"/>
+          <w:tblHeader w:val="0"/>
+        </w:trPr>
+        <w:tc>
+          <w:tcPr/>
+          <w:p>
+            <w:pPr>
+              <w:rPr>
+                <w:rFonts w:ascii="Roboto Medium" w:cs="Roboto Medium" w:eastAsia="Roboto Medium" w:hAnsi="Roboto Medium"/>
+                <w:color w:val="1f1f1f"/>
+                <w:sz w:val="24"/>
+                <w:szCs w:val="24"/>
+              </w:rPr>
+            </w:pPr>
+            <w:r>
+              <w:rPr>
+                <w:rFonts w:ascii="Roboto Medium" w:cs="Roboto Medium" w:eastAsia="Roboto Medium" w:hAnsi="Roboto Medium"/>
+                <w:color w:val="1f1f1f"/>
+                <w:sz w:val="24"/>
+                <w:szCs w:val="24"/>
+                <w:rtl w:val="0"/>
+              </w:rPr>
+              <w:t xml:space="preserve">Column 1</w:t>
+            </w:r>
+          </w:p>
+        </w:tc>
+        <w:tc>
+          <w:tcPr/>
+          <w:p>
+            <w:pPr>
+              <w:rPr>
+                <w:rFonts w:ascii="Roboto Medium" w:cs="Roboto Medium" w:eastAsia="Roboto Medium" w:hAnsi="Roboto Medium"/>
+                <w:color w:val="1f1f1f"/>
+                <w:sz w:val="24"/>
+                <w:szCs w:val="24"/>
+              </w:rPr>
+            </w:pPr>
+            <w:r>
+              <w:rPr>
+                <w:rFonts w:ascii="Roboto Medium" w:cs="Roboto Medium" w:eastAsia="Roboto Medium" w:hAnsi="Roboto Medium"/>
+                <w:color w:val="1f1f1f"/>
+                <w:sz w:val="24"/>
+                <w:szCs w:val="24"/>
+                <w:rtl w:val="0"/>
+              </w:rPr>
+              <w:t xml:space="preserve">Column 2</w:t>
+            </w:r>
+          </w:p>
+        </w:tc>
+        <w:tc>
+          <w:tcPr/>
+          <w:p>
+            <w:pPr>
+              <w:rPr>
+                <w:rFonts w:ascii="Roboto Medium" w:cs="Roboto Medium" w:eastAsia="Roboto Medium" w:hAnsi="Roboto Medium"/>
+                <w:color w:val="1f1f1f"/>
+                <w:sz w:val="24"/>
+                <w:szCs w:val="24"/>
+              </w:rPr>
+            </w:pPr>
+            <w:r>
+              <w:rPr>
+                <w:rFonts w:ascii="Roboto Medium" w:cs="Roboto Medium" w:eastAsia="Roboto Medium" w:hAnsi="Roboto Medium"/>
+                <w:color w:val="1f1f1f"/>
+                <w:sz w:val="24"/>
+                <w:szCs w:val="24"/>
+                <w:rtl w:val="0"/>
+              </w:rPr>
+              <w:t xml:space="preserve">Column 3</w:t>
+            </w:r>
+          </w:p>
+        </w:tc>
+      </w:tr>
+      <w:tr>
+        <w:trPr>
+          <w:cantSplit w:val="0"/>
+          <w:tblHeader w:val="0"/>
+        </w:trPr>
+        <w:tc>
+          <w:tcPr/>
+          <w:p>
+            <w:pPr>
+              <w:rPr>
+                <w:rFonts w:ascii="Roboto" w:cs="Roboto" w:eastAsia="Roboto" w:hAnsi="Roboto"/>
+                <w:color w:val="1f1f1f"/>
+                <w:sz w:val="24"/>
+                <w:szCs w:val="24"/>
+              </w:rPr>
+            </w:pPr>
+            <w:r>
+              <w:rPr>
+                <w:rFonts w:ascii="Roboto" w:cs="Roboto" w:eastAsia="Roboto" w:hAnsi="Roboto"/>
+                <w:color w:val="1f1f1f"/>
+                <w:sz w:val="24"/>
+                <w:szCs w:val="24"/>
+                <w:rtl w:val="0"/>
+              </w:rPr>
+              <w:t xml:space="preserve">Item A</w:t>
+            </w:r>
+          </w:p>
+        </w:tc>
+        <w:tc>
+          <w:tcPr/>
+          <w:p>
+            <w:pPr>
+              <w:rPr>
+                <w:rFonts w:ascii="Roboto" w:cs="Roboto" w:eastAsia="Roboto" w:hAnsi="Roboto"/>
+                <w:color w:val="1f1f1f"/>
+                <w:sz w:val="24"/>
+                <w:szCs w:val="24"/>
+              </w:rPr>
+            </w:pPr>
+            <w:r>
+              <w:rPr>
+                <w:rFonts w:ascii="Roboto" w:cs="Roboto" w:eastAsia="Roboto" w:hAnsi="Roboto"/>
+                <w:color w:val="1f1f1f"/>
+                <w:sz w:val="24"/>
+                <w:szCs w:val="24"/>
+                <w:rtl w:val="0"/>
+              </w:rPr>
+              <w:t xml:space="preserve">Value 1</w:t>
+            </w:r>
+          </w:p>
+        </w:tc>
+        <w:tc>
+          <w:tcPr/>
+          <w:p>
+            <w:pPr>
+              <w:rPr>
+                <w:rFonts w:ascii="Roboto" w:cs="Roboto" w:eastAsia="Roboto" w:hAnsi="Roboto"/>
+                <w:color w:val="1f1f1f"/>
+                <w:sz w:val="24"/>
+                <w:szCs w:val="24"/>
+              </w:rPr>
+            </w:pPr>
+            <w:r>
+              <w:rPr>
+                <w:rFonts w:ascii="Roboto" w:cs="Roboto" w:eastAsia="Roboto" w:hAnsi="Roboto"/>
+                <w:color w:val="1f1f1f"/>
+                <w:sz w:val="24"/>
+                <w:szCs w:val="24"/>
+                <w:rtl w:val="0"/>
+              </w:rPr>
+              <w:t xml:space="preserve">Detail X</w:t>
+            </w:r>
+          </w:p>
+        </w:tc>
+      </w:tr>
+      <w:tr>
+        <w:trPr>
+          <w:cantSplit w:val="0"/>
+          <w:tblHeader w:val="0"/>
+        </w:trPr>
+        <w:tc>
+          <w:tcPr/>
+          <w:p>
+            <w:pPr>
+              <w:rPr>
+                <w:rFonts w:ascii="Roboto" w:cs="Roboto" w:eastAsia="Roboto" w:hAnsi="Roboto"/>
+                <w:color w:val="1f1f1f"/>
+                <w:sz w:val="24"/>
+                <w:szCs w:val="24"/>
+              </w:rPr>
+            </w:pPr>
+            <w:r>
+              <w:rPr>
+                <w:rFonts w:ascii="Roboto" w:cs="Roboto" w:eastAsia="Roboto" w:hAnsi="Roboto"/>
+                <w:color w:val="1f1f1f"/>
+                <w:sz w:val="24"/>
+                <w:szCs w:val="24"/>
+                <w:rtl w:val="0"/>
+              </w:rPr>
+              <w:t xml:space="preserve">Item B</w:t>
+            </w:r>
+          </w:p>
+        </w:tc>
+        <w:tc>
+          <w:tcPr/>
+          <w:p>
+            <w:pPr>
+              <w:rPr>
+                <w:rFonts w:ascii="Roboto" w:cs="Roboto" w:eastAsia="Roboto" w:hAnsi="Roboto"/>
+                <w:color w:val="1f1f1f"/>
+                <w:sz w:val="24"/>
+                <w:szCs w:val="24"/>
+              </w:rPr>
+            </w:pPr>
+            <w:r>
+              <w:rPr>
+                <w:rFonts w:ascii="Roboto" w:cs="Roboto" w:eastAsia="Roboto" w:hAnsi="Roboto"/>
+                <w:color w:val="1f1f1f"/>
+                <w:sz w:val="24"/>
+                <w:szCs w:val="24"/>
+                <w:rtl w:val="0"/>
+              </w:rPr>
+              <w:t xml:space="preserve">Value 2</w:t>
+            </w:r>
+          </w:p>
+        </w:tc>
+        <w:tc>
+          <w:tcPr/>
+          <w:p>
+            <w:pPr>
+              <w:rPr>
+                <w:rFonts w:ascii="Roboto" w:cs="Roboto" w:eastAsia="Roboto" w:hAnsi="Roboto"/>
+                <w:color w:val="1f1f1f"/>
+                <w:sz w:val="24"/>
+                <w:szCs w:val="24"/>
+              </w:rPr>
+            </w:pPr>
+            <w:r>
+              <w:rPr>
+                <w:rFonts w:ascii="Roboto" w:cs="Roboto" w:eastAsia="Roboto" w:hAnsi="Roboto"/>
+                <w:color w:val="1f1f1f"/>
+                <w:sz w:val="24"/>
+                <w:szCs w:val="24"/>
+                <w:rtl w:val="0"/>
+              </w:rPr>
+              <w:t xml:space="preserve">Detail Y</w:t>
+            </w:r>
+          </w:p>
+        </w:tc>
+      </w:tr>
+      <w:tr>
+        <w:trPr>
+          <w:cantSplit w:val="0"/>
+          <w:tblHeader w:val="0"/>
+        </w:trPr>
+        <w:tc>
+          <w:tcPr/>
+          <w:p>
+            <w:pPr>
+              <w:rPr>
+                <w:rFonts w:ascii="Roboto" w:cs="Roboto" w:eastAsia="Roboto" w:hAnsi="Roboto"/>
+                <w:color w:val="1f1f1f"/>
+                <w:sz w:val="24"/>
+                <w:szCs w:val="24"/>
+              </w:rPr>
+            </w:pPr>
+            <w:r>
+              <w:rPr>
+                <w:rFonts w:ascii="Roboto" w:cs="Roboto" w:eastAsia="Roboto" w:hAnsi="Roboto"/>
+                <w:color w:val="1f1f1f"/>
+                <w:sz w:val="24"/>
+                <w:szCs w:val="24"/>
+                <w:rtl w:val="0"/>
+              </w:rPr>
+              <w:t xml:space="preserve">Item C</w:t>
+            </w:r>
+          </w:p>
+        </w:tc>
+        <w:tc>
+          <w:tcPr/>
+          <w:p>
+            <w:pPr>
+              <w:rPr>
+                <w:rFonts w:ascii="Roboto" w:cs="Roboto" w:eastAsia="Roboto" w:hAnsi="Roboto"/>
+                <w:color w:val="1f1f1f"/>
+                <w:sz w:val="24"/>
+                <w:szCs w:val="24"/>
+              </w:rPr>
+            </w:pPr>
+            <w:r>
+              <w:rPr>
+                <w:rFonts w:ascii="Roboto" w:cs="Roboto" w:eastAsia="Roboto" w:hAnsi="Roboto"/>
+                <w:color w:val="1f1f1f"/>
+                <w:sz w:val="24"/>
+                <w:szCs w:val="24"/>
+                <w:rtl w:val="0"/>
+              </w:rPr>
+              <w:t xml:space="preserve">Value 3</w:t>
+            </w:r>
+          </w:p>
+        </w:tc>
+        <w:tc>
+          <w:tcPr/>
+          <w:p>
+            <w:pPr>
+              <w:rPr>
+                <w:rFonts w:ascii="Roboto" w:cs="Roboto" w:eastAsia="Roboto" w:hAnsi="Roboto"/>
+                <w:color w:val="1f1f1f"/>
+                <w:sz w:val="24"/>
+                <w:szCs w:val="24"/>
+              </w:rPr>
+            </w:pPr>
+            <w:r>
+              <w:rPr>
+                <w:rFonts w:ascii="Roboto" w:cs="Roboto" w:eastAsia="Roboto" w:hAnsi="Roboto"/>
+                <w:color w:val="1f1f1f"/>
+                <w:sz w:val="24"/>
+                <w:szCs w:val="24"/>
+                <w:rtl w:val="0"/>
+              </w:rPr>
+              <w:t xml:space="preserve">Detail Z</w:t>
+            </w:r>
+          </w:p>
+        </w:tc>
+      </w:tr>
+      <w:tr>
+        <w:trPr>
+          <w:cantSplit w:val="0"/>
+          <w:tblHeader w:val="0"/>
+        </w:trPr>
+        <w:tc>
+          <w:tcPr/>
+          <w:p>
+            <w:pPr>
+              <w:rPr>
+                <w:rFonts w:ascii="Roboto" w:cs="Roboto" w:eastAsia="Roboto" w:hAnsi="Roboto"/>
+                <w:color w:val="1f1f1f"/>
+                <w:sz w:val="24"/>
+                <w:szCs w:val="24"/>
+              </w:rPr>
+            </w:pPr>
+            <w:r>
+              <w:rPr>
+                <w:rFonts w:ascii="Roboto" w:cs="Roboto" w:eastAsia="Roboto" w:hAnsi="Roboto"/>
+                <w:color w:val="1f1f1f"/>
+                <w:sz w:val="24"/>
+                <w:szCs w:val="24"/>
+                <w:rtl w:val="0"/>
+              </w:rPr>
+              <w:t xml:space="preserve">Item D</w:t>
+            </w:r>
+          </w:p>
+        </w:tc>
+        <w:tc>
+          <w:tcPr/>
+          <w:p>
+            <w:pPr>
+              <w:rPr>
+                <w:rFonts w:ascii="Roboto" w:cs="Roboto" w:eastAsia="Roboto" w:hAnsi="Roboto"/>
+                <w:color w:val="1f1f1f"/>
+                <w:sz w:val="24"/>
+                <w:szCs w:val="24"/>
+              </w:rPr>
+            </w:pPr>
+            <w:r>
+              <w:rPr>
+                <w:rFonts w:ascii="Roboto" w:cs="Roboto" w:eastAsia="Roboto" w:hAnsi="Roboto"/>
+                <w:color w:val="1f1f1f"/>
+                <w:sz w:val="24"/>
+                <w:szCs w:val="24"/>
+                <w:rtl w:val="0"/>
+              </w:rPr>
+              <w:t xml:space="preserve">Value 4</w:t>
+            </w:r>
+          </w:p>
+        </w:tc>
+        <w:tc>
+          <w:tcPr/>
+          <w:p>
+            <w:pPr>
+              <w:rPr>
+                <w:rFonts w:ascii="Roboto" w:cs="Roboto" w:eastAsia="Roboto" w:hAnsi="Roboto"/>
+                <w:color w:val="1f1f1f"/>
+                <w:sz w:val="24"/>
+                <w:szCs w:val="24"/>
+              </w:rPr>
+            </w:pPr>
+            <w:r>
+              <w:rPr>
+                <w:rFonts w:ascii="Roboto" w:cs="Roboto" w:eastAsia="Roboto" w:hAnsi="Roboto"/>
+                <w:color w:val="1f1f1f"/>
+                <w:sz w:val="24"/>
+                <w:szCs w:val="24"/>
+                <w:rtl w:val="0"/>
+              </w:rPr>
+              <w:t xml:space="preserve">Detail W</w:t>
+            </w:r>
+          </w:p>
+        </w:tc>
+      </w:tr>
+    </w:tbl>
+    <w:p>
+      <w:pPr>
+        <w:rPr/>
+      </w:pPr>
+      <w:r>
+        <w:rPr>
+          <w:rtl w:val="0"/>
+        </w:rPr>
       </w:r>
     </w:p>
     <w:sectPr>
       <w:pgSz w:h="16838" w:w="11906" w:orient="portrait"/>
-      <w:pgMar w:bottom="1134" w:top="1134" w:left="1134" w:right="1134" w:header="0" w:footer="0"/>
+      <w:pgMar w:bottom="1133.8582677165355" w:top="1700.7874015748032" w:left="1700.7874015748032" w:right="1133.8582677165355" w:header="720" w:footer="720"/>
       <w:pgNumType w:start="1"/>
     </w:sectPr>
   </w:body>
@@ -31,14 +493,16 @@
   <w:docDefaults>
     <w:rPrDefault>
       <w:rPr>
-        <w:rFonts w:ascii="Liberation Serif" w:cs="Liberation Serif" w:eastAsia="Liberation Serif" w:hAnsi="Liberation Serif"/>
-        <w:sz w:val="24"/>
-        <w:szCs w:val="24"/>
+        <w:rFonts w:ascii="Arial" w:cs="Arial" w:eastAsia="Arial" w:hAnsi="Arial"/>
+        <w:sz w:val="22"/>
+        <w:szCs w:val="22"/>
         <w:lang w:val="pt_BR"/>
       </w:rPr>
     </w:rPrDefault>
     <w:pPrDefault>
-      <w:pPr/>
+      <w:pPr>
+        <w:spacing w:line="276" w:lineRule="auto"/>
+      </w:pPr>
     </w:pPrDefault>
   </w:docDefaults>
   <w:style w:type="table" w:styleId="TableNormal" w:default="1">
@@ -63,13 +527,11 @@
       <w:keepNext w:val="1"/>
       <w:keepLines w:val="1"/>
       <w:pageBreakBefore w:val="0"/>
-      <w:spacing w:after="120" w:before="480" w:lineRule="auto"/>
+      <w:spacing w:after="120" w:before="400" w:lineRule="auto"/>
     </w:pPr>
     <w:rPr>
-      <w:b w:val="1"/>
-      <w:bCs w:val="1"/>
-      <w:sz w:val="48"/>
-      <w:szCs w:val="48"/>
+      <w:sz w:val="40"/>
+      <w:szCs w:val="40"/>
     </w:rPr>
   </w:style>
   <w:style w:type="paragraph" w:styleId="Heading2">
@@ -80,17 +542,35 @@
       <w:keepNext w:val="1"/>
       <w:keepLines w:val="1"/>
       <w:pageBreakBefore w:val="0"/>
-      <w:spacing w:after="80" w:before="360" w:lineRule="auto"/>
+      <w:spacing w:after="120" w:before="360" w:lineRule="auto"/>
     </w:pPr>
     <w:rPr>
-      <w:b w:val="1"/>
-      <w:bCs w:val="1"/>
-      <w:sz w:val="36"/>
-      <w:szCs w:val="36"/>
+      <w:b w:val="0"/>
+      <w:bCs w:val="0"/>
+      <w:sz w:val="32"/>
+      <w:szCs w:val="32"/>
     </w:rPr>
   </w:style>
   <w:style w:type="paragraph" w:styleId="Heading3">
     <w:name w:val="heading 3"/>
+    <w:basedOn w:val="Normal"/>
+    <w:next w:val="Normal"/>
+    <w:pPr>
+      <w:keepNext w:val="1"/>
+      <w:keepLines w:val="1"/>
+      <w:pageBreakBefore w:val="0"/>
+      <w:spacing w:after="80" w:before="320" w:lineRule="auto"/>
+    </w:pPr>
+    <w:rPr>
+      <w:b w:val="0"/>
+      <w:bCs w:val="0"/>
+      <w:color w:val="434343"/>
+      <w:sz w:val="28"/>
+      <w:szCs w:val="28"/>
+    </w:rPr>
+  </w:style>
+  <w:style w:type="paragraph" w:styleId="Heading4">
+    <w:name w:val="heading 4"/>
     <w:basedOn w:val="Normal"/>
     <w:next w:val="Normal"/>
     <w:pPr>
@@ -100,25 +580,7 @@
       <w:spacing w:after="80" w:before="280" w:lineRule="auto"/>
     </w:pPr>
     <w:rPr>
-      <w:b w:val="1"/>
-      <w:bCs w:val="1"/>
-      <w:sz w:val="28"/>
-      <w:szCs w:val="28"/>
-    </w:rPr>
-  </w:style>
-  <w:style w:type="paragraph" w:styleId="Heading4">
-    <w:name w:val="heading 4"/>
-    <w:basedOn w:val="Normal"/>
-    <w:next w:val="Normal"/>
-    <w:pPr>
-      <w:keepNext w:val="1"/>
-      <w:keepLines w:val="1"/>
-      <w:pageBreakBefore w:val="0"/>
-      <w:spacing w:after="40" w:before="240" w:lineRule="auto"/>
-    </w:pPr>
-    <w:rPr>
-      <w:b w:val="1"/>
-      <w:bCs w:val="1"/>
+      <w:color w:val="666666"/>
       <w:sz w:val="24"/>
       <w:szCs w:val="24"/>
     </w:rPr>
@@ -131,11 +593,10 @@
       <w:keepNext w:val="1"/>
       <w:keepLines w:val="1"/>
       <w:pageBreakBefore w:val="0"/>
-      <w:spacing w:after="40" w:before="220" w:lineRule="auto"/>
+      <w:spacing w:after="80" w:before="240" w:lineRule="auto"/>
     </w:pPr>
     <w:rPr>
-      <w:b w:val="1"/>
-      <w:bCs w:val="1"/>
+      <w:color w:val="666666"/>
       <w:sz w:val="22"/>
       <w:szCs w:val="22"/>
     </w:rPr>
@@ -148,13 +609,14 @@
       <w:keepNext w:val="1"/>
       <w:keepLines w:val="1"/>
       <w:pageBreakBefore w:val="0"/>
-      <w:spacing w:after="40" w:before="200" w:lineRule="auto"/>
+      <w:spacing w:after="80" w:before="240" w:lineRule="auto"/>
     </w:pPr>
     <w:rPr>
-      <w:b w:val="1"/>
-      <w:bCs w:val="1"/>
-      <w:sz w:val="20"/>
-      <w:szCs w:val="20"/>
+      <w:i w:val="1"/>
+      <w:iCs w:val="1"/>
+      <w:color w:val="666666"/>
+      <w:sz w:val="22"/>
+      <w:szCs w:val="22"/>
     </w:rPr>
   </w:style>
   <w:style w:type="paragraph" w:styleId="Title">
@@ -165,13 +627,11 @@
       <w:keepNext w:val="1"/>
       <w:keepLines w:val="1"/>
       <w:pageBreakBefore w:val="0"/>
-      <w:spacing w:after="120" w:before="480" w:lineRule="auto"/>
+      <w:spacing w:after="60" w:before="0" w:lineRule="auto"/>
     </w:pPr>
     <w:rPr>
-      <w:b w:val="1"/>
-      <w:bCs w:val="1"/>
-      <w:sz w:val="72"/>
-      <w:szCs w:val="72"/>
+      <w:sz w:val="52"/>
+      <w:szCs w:val="52"/>
     </w:rPr>
   </w:style>
   <w:style w:type="paragraph" w:styleId="Subtitle">
@@ -182,16 +642,23 @@
       <w:keepNext w:val="1"/>
       <w:keepLines w:val="1"/>
       <w:pageBreakBefore w:val="0"/>
-      <w:spacing w:after="80" w:before="360" w:lineRule="auto"/>
+      <w:spacing w:after="320" w:before="0" w:lineRule="auto"/>
     </w:pPr>
     <w:rPr>
-      <w:rFonts w:ascii="Georgia" w:cs="Georgia" w:eastAsia="Georgia" w:hAnsi="Georgia"/>
-      <w:i w:val="1"/>
-      <w:iCs w:val="1"/>
+      <w:rFonts w:ascii="Arial" w:cs="Arial" w:eastAsia="Arial" w:hAnsi="Arial"/>
+      <w:i w:val="0"/>
+      <w:iCs w:val="0"/>
       <w:color w:val="666666"/>
-      <w:sz w:val="48"/>
-      <w:szCs w:val="48"/>
+      <w:sz w:val="30"/>
+      <w:szCs w:val="30"/>
     </w:rPr>
+  </w:style>
+  <w:style w:type="table" w:styleId="Table1">
+    <w:basedOn w:val="TableNormal"/>
+    <w:tblPr>
+      <w:tblStyleRowBandSize w:val="1"/>
+      <w:tblStyleColBandSize w:val="1"/>
+    </w:tblPr>
   </w:style>
 </w:styles>
 </file>

</xml_diff>